<commit_message>
Updates & fixes for Portfolio
</commit_message>
<xml_diff>
--- a/Citations.docx
+++ b/Citations.docx
@@ -1,6 +1,6 @@
 
 <file path=word/document.xml><?xml version="1.0" encoding="utf-8"?>
-<w:document xmlns:wpc="http://schemas.microsoft.com/office/word/2010/wordprocessingCanvas" xmlns:cx="http://schemas.microsoft.com/office/drawing/2014/chartex" xmlns:cx1="http://schemas.microsoft.com/office/drawing/2015/9/8/chartex" xmlns:cx2="http://schemas.microsoft.com/office/drawing/2015/10/21/chartex" xmlns:cx3="http://schemas.microsoft.com/office/drawing/2016/5/9/chartex" xmlns:cx4="http://schemas.microsoft.com/office/drawing/2016/5/10/chartex" xmlns:cx5="http://schemas.microsoft.com/office/drawing/2016/5/11/chartex" xmlns:cx6="http://schemas.microsoft.com/office/drawing/2016/5/12/chartex" xmlns:cx7="http://schemas.microsoft.com/office/drawing/2016/5/13/chartex" xmlns:cx8="http://schemas.microsoft.com/office/drawing/2016/5/14/chartex" xmlns:mc="http://schemas.openxmlformats.org/markup-compatibility/2006" xmlns:aink="http://schemas.microsoft.com/office/drawing/2016/ink" xmlns:am3d="http://schemas.microsoft.com/office/drawing/2017/model3d" xmlns:o="urn:schemas-microsoft-com:office:office" xmlns:oel="http://schemas.microsoft.com/office/2019/extlst" xmlns:r="http://schemas.openxmlformats.org/officeDocument/2006/relationships" xmlns:m="http://schemas.openxmlformats.org/officeDocument/2006/math" xmlns:v="urn:schemas-microsoft-com:vml" xmlns:wp14="http://schemas.microsoft.com/office/word/2010/wordprocessingDrawing" xmlns:wp="http://schemas.openxmlformats.org/drawingml/2006/wordprocessingDrawing" xmlns:w10="urn:schemas-microsoft-com:office:word" xmlns:w="http://schemas.openxmlformats.org/wordprocessingml/2006/main" xmlns:w14="http://schemas.microsoft.com/office/word/2010/wordml" xmlns:w15="http://schemas.microsoft.com/office/word/2012/wordml" xmlns:w16cex="http://schemas.microsoft.com/office/word/2018/wordml/cex" xmlns:w16cid="http://schemas.microsoft.com/office/word/2016/wordml/cid" xmlns:w16="http://schemas.microsoft.com/office/word/2018/wordml" xmlns:w16du="http://schemas.microsoft.com/office/word/2023/wordml/word16du" xmlns:w16sdtdh="http://schemas.microsoft.com/office/word/2020/wordml/sdtdatahash" xmlns:w16sdtfl="http://schemas.microsoft.com/office/word/2024/wordml/sdtformatlock" xmlns:w16se="http://schemas.microsoft.com/office/word/2015/wordml/symex" xmlns:wpg="http://schemas.microsoft.com/office/word/2010/wordprocessingGroup" xmlns:wpi="http://schemas.microsoft.com/office/word/2010/wordprocessingInk" xmlns:wne="http://schemas.microsoft.com/office/word/2006/wordml" xmlns:wps="http://schemas.microsoft.com/office/word/2010/wordprocessingShape" mc:Ignorable="w14 w15 w16se w16cid w16 w16cex w16sdtdh w16sdtfl w16du wp14">
+<w:document xmlns:wpc="http://schemas.microsoft.com/office/word/2010/wordprocessingCanvas" xmlns:cx="http://schemas.microsoft.com/office/drawing/2014/chartex" xmlns:cx1="http://schemas.microsoft.com/office/drawing/2015/9/8/chartex" xmlns:cx2="http://schemas.microsoft.com/office/drawing/2015/10/21/chartex" xmlns:cx3="http://schemas.microsoft.com/office/drawing/2016/5/9/chartex" xmlns:cx4="http://schemas.microsoft.com/office/drawing/2016/5/10/chartex" xmlns:cx5="http://schemas.microsoft.com/office/drawing/2016/5/11/chartex" xmlns:cx6="http://schemas.microsoft.com/office/drawing/2016/5/12/chartex" xmlns:cx7="http://schemas.microsoft.com/office/drawing/2016/5/13/chartex" xmlns:cx8="http://schemas.microsoft.com/office/drawing/2016/5/14/chartex" xmlns:mc="http://schemas.openxmlformats.org/markup-compatibility/2006" xmlns:aink="http://schemas.microsoft.com/office/drawing/2016/ink" xmlns:am3d="http://schemas.microsoft.com/office/drawing/2017/model3d" xmlns:o="urn:schemas-microsoft-com:office:office" xmlns:oel="http://schemas.microsoft.com/office/2019/extlst" xmlns:r="http://schemas.openxmlformats.org/officeDocument/2006/relationships" xmlns:m="http://schemas.openxmlformats.org/officeDocument/2006/math" xmlns:v="urn:schemas-microsoft-com:vml" xmlns:wp14="http://schemas.microsoft.com/office/word/2010/wordprocessingDrawing" xmlns:wp="http://schemas.openxmlformats.org/drawingml/2006/wordprocessingDrawing" xmlns:w10="urn:schemas-microsoft-com:office:word" xmlns:w="http://schemas.openxmlformats.org/wordprocessingml/2006/main" xmlns:w14="http://schemas.microsoft.com/office/word/2010/wordml" xmlns:w15="http://schemas.microsoft.com/office/word/2012/wordml" xmlns:w16cei="http://schemas.microsoft.com/office/word/2026/wordml/cei" xmlns:w16cex="http://schemas.microsoft.com/office/word/2018/wordml/cex" xmlns:w16cid="http://schemas.microsoft.com/office/word/2016/wordml/cid" xmlns:w16="http://schemas.microsoft.com/office/word/2018/wordml" xmlns:w16du="http://schemas.microsoft.com/office/word/2023/wordml/word16du" xmlns:w16sdtdh="http://schemas.microsoft.com/office/word/2020/wordml/sdtdatahash" xmlns:w16sdtfl="http://schemas.microsoft.com/office/word/2024/wordml/sdtformatlock" xmlns:w16se="http://schemas.microsoft.com/office/word/2015/wordml/symex" xmlns:wpg="http://schemas.microsoft.com/office/word/2010/wordprocessingGroup" xmlns:wpi="http://schemas.microsoft.com/office/word/2010/wordprocessingInk" xmlns:wne="http://schemas.microsoft.com/office/word/2006/wordml" xmlns:wps="http://schemas.microsoft.com/office/word/2010/wordprocessingShape" mc:Ignorable="w14 w15 w16se w16cid w16 w16cex w16sdtdh w16sdtfl w16du wp14">
   <w:body>
     <w:p>
       <w:r>
@@ -289,6 +289,16 @@
         </w:r>
       </w:hyperlink>
     </w:p>
+    <w:p>
+      <w:hyperlink r:id="rId27" w:history="1">
+        <w:r>
+          <w:rPr>
+            <w:rStyle w:val="Hyperlink"/>
+          </w:rPr>
+          <w:t>https://www.pexels.com/photo/a-full-moon-in-the-night-sky-5489557/</w:t>
+        </w:r>
+      </w:hyperlink>
+    </w:p>
     <w:p/>
     <w:p>
       <w:r>
@@ -296,7 +306,7 @@
       </w:r>
     </w:p>
     <w:p>
-      <w:hyperlink r:id="rId27" w:history="1">
+      <w:hyperlink r:id="rId28" w:history="1">
         <w:r>
           <w:rPr>
             <w:rStyle w:val="Hyperlink"/>
@@ -306,7 +316,7 @@
       </w:hyperlink>
     </w:p>
     <w:p>
-      <w:hyperlink r:id="rId28" w:history="1">
+      <w:hyperlink r:id="rId29" w:history="1">
         <w:r>
           <w:rPr>
             <w:rStyle w:val="Hyperlink"/>
@@ -316,7 +326,7 @@
       </w:hyperlink>
     </w:p>
     <w:p>
-      <w:hyperlink r:id="rId29" w:history="1">
+      <w:hyperlink r:id="rId30" w:history="1">
         <w:r>
           <w:rPr>
             <w:rStyle w:val="Hyperlink"/>
@@ -326,7 +336,7 @@
       </w:hyperlink>
     </w:p>
     <w:p>
-      <w:hyperlink r:id="rId30" w:history="1">
+      <w:hyperlink r:id="rId31" w:history="1">
         <w:r>
           <w:rPr>
             <w:rStyle w:val="Hyperlink"/>
@@ -342,7 +352,7 @@
       </w:r>
     </w:p>
     <w:p>
-      <w:hyperlink r:id="rId31" w:history="1">
+      <w:hyperlink r:id="rId32" w:history="1">
         <w:r>
           <w:rPr>
             <w:rStyle w:val="Hyperlink"/>
@@ -352,7 +362,7 @@
       </w:hyperlink>
     </w:p>
     <w:p>
-      <w:hyperlink r:id="rId32" w:history="1">
+      <w:hyperlink r:id="rId33" w:history="1">
         <w:r>
           <w:rPr>
             <w:rStyle w:val="Hyperlink"/>
@@ -362,7 +372,7 @@
       </w:hyperlink>
     </w:p>
     <w:p>
-      <w:hyperlink r:id="rId33" w:history="1">
+      <w:hyperlink r:id="rId34" w:history="1">
         <w:r>
           <w:rPr>
             <w:rStyle w:val="Hyperlink"/>
@@ -372,7 +382,7 @@
       </w:hyperlink>
     </w:p>
     <w:p>
-      <w:hyperlink r:id="rId34" w:history="1">
+      <w:hyperlink r:id="rId35" w:history="1">
         <w:r>
           <w:rPr>
             <w:rStyle w:val="Hyperlink"/>
@@ -382,7 +392,7 @@
       </w:hyperlink>
     </w:p>
     <w:p>
-      <w:hyperlink r:id="rId35" w:history="1">
+      <w:hyperlink r:id="rId36" w:history="1">
         <w:r>
           <w:rPr>
             <w:rStyle w:val="Hyperlink"/>
@@ -392,7 +402,7 @@
       </w:hyperlink>
     </w:p>
     <w:p>
-      <w:hyperlink r:id="rId36" w:history="1">
+      <w:hyperlink r:id="rId37" w:history="1">
         <w:r>
           <w:rPr>
             <w:rStyle w:val="Hyperlink"/>
@@ -402,7 +412,7 @@
       </w:hyperlink>
     </w:p>
     <w:p>
-      <w:hyperlink r:id="rId37" w:history="1">
+      <w:hyperlink r:id="rId38" w:history="1">
         <w:r>
           <w:rPr>
             <w:rStyle w:val="Hyperlink"/>
@@ -412,7 +422,7 @@
       </w:hyperlink>
     </w:p>
     <w:p>
-      <w:hyperlink r:id="rId38" w:history="1">
+      <w:hyperlink r:id="rId39" w:history="1">
         <w:r>
           <w:rPr>
             <w:rStyle w:val="Hyperlink"/>
@@ -422,7 +432,7 @@
       </w:hyperlink>
     </w:p>
     <w:p>
-      <w:hyperlink r:id="rId39" w:history="1">
+      <w:hyperlink r:id="rId40" w:history="1">
         <w:r>
           <w:rPr>
             <w:rStyle w:val="Hyperlink"/>
@@ -432,7 +442,7 @@
       </w:hyperlink>
     </w:p>
     <w:p>
-      <w:hyperlink r:id="rId40" w:history="1">
+      <w:hyperlink r:id="rId41" w:history="1">
         <w:r>
           <w:rPr>
             <w:rStyle w:val="Hyperlink"/>
@@ -442,7 +452,7 @@
       </w:hyperlink>
     </w:p>
     <w:p>
-      <w:hyperlink r:id="rId41" w:history="1">
+      <w:hyperlink r:id="rId42" w:history="1">
         <w:r>
           <w:rPr>
             <w:rStyle w:val="Hyperlink"/>
@@ -452,7 +462,7 @@
       </w:hyperlink>
     </w:p>
     <w:p>
-      <w:hyperlink r:id="rId42" w:history="1">
+      <w:hyperlink r:id="rId43" w:history="1">
         <w:r>
           <w:rPr>
             <w:rStyle w:val="Hyperlink"/>
@@ -472,7 +482,7 @@
 </file>
 
 <file path=word/numbering.xml><?xml version="1.0" encoding="utf-8"?>
-<w:numbering xmlns:wpc="http://schemas.microsoft.com/office/word/2010/wordprocessingCanvas" xmlns:cx="http://schemas.microsoft.com/office/drawing/2014/chartex" xmlns:cx1="http://schemas.microsoft.com/office/drawing/2015/9/8/chartex" xmlns:cx2="http://schemas.microsoft.com/office/drawing/2015/10/21/chartex" xmlns:cx3="http://schemas.microsoft.com/office/drawing/2016/5/9/chartex" xmlns:cx4="http://schemas.microsoft.com/office/drawing/2016/5/10/chartex" xmlns:cx5="http://schemas.microsoft.com/office/drawing/2016/5/11/chartex" xmlns:cx6="http://schemas.microsoft.com/office/drawing/2016/5/12/chartex" xmlns:cx7="http://schemas.microsoft.com/office/drawing/2016/5/13/chartex" xmlns:cx8="http://schemas.microsoft.com/office/drawing/2016/5/14/chartex" xmlns:mc="http://schemas.openxmlformats.org/markup-compatibility/2006" xmlns:aink="http://schemas.microsoft.com/office/drawing/2016/ink" xmlns:am3d="http://schemas.microsoft.com/office/drawing/2017/model3d" xmlns:o="urn:schemas-microsoft-com:office:office" xmlns:oel="http://schemas.microsoft.com/office/2019/extlst" xmlns:r="http://schemas.openxmlformats.org/officeDocument/2006/relationships" xmlns:m="http://schemas.openxmlformats.org/officeDocument/2006/math" xmlns:v="urn:schemas-microsoft-com:vml" xmlns:wp14="http://schemas.microsoft.com/office/word/2010/wordprocessingDrawing" xmlns:wp="http://schemas.openxmlformats.org/drawingml/2006/wordprocessingDrawing" xmlns:w10="urn:schemas-microsoft-com:office:word" xmlns:w="http://schemas.openxmlformats.org/wordprocessingml/2006/main" xmlns:w14="http://schemas.microsoft.com/office/word/2010/wordml" xmlns:w15="http://schemas.microsoft.com/office/word/2012/wordml" xmlns:w16cex="http://schemas.microsoft.com/office/word/2018/wordml/cex" xmlns:w16cid="http://schemas.microsoft.com/office/word/2016/wordml/cid" xmlns:w16="http://schemas.microsoft.com/office/word/2018/wordml" xmlns:w16du="http://schemas.microsoft.com/office/word/2023/wordml/word16du" xmlns:w16sdtdh="http://schemas.microsoft.com/office/word/2020/wordml/sdtdatahash" xmlns:w16sdtfl="http://schemas.microsoft.com/office/word/2024/wordml/sdtformatlock" xmlns:w16se="http://schemas.microsoft.com/office/word/2015/wordml/symex" xmlns:wpg="http://schemas.microsoft.com/office/word/2010/wordprocessingGroup" xmlns:wpi="http://schemas.microsoft.com/office/word/2010/wordprocessingInk" xmlns:wne="http://schemas.microsoft.com/office/word/2006/wordml" xmlns:wps="http://schemas.microsoft.com/office/word/2010/wordprocessingShape" mc:Ignorable="w14 w15 w16se w16cid w16 w16cex w16sdtdh w16sdtfl w16du wp14">
+<w:numbering xmlns:wpc="http://schemas.microsoft.com/office/word/2010/wordprocessingCanvas" xmlns:cx="http://schemas.microsoft.com/office/drawing/2014/chartex" xmlns:cx1="http://schemas.microsoft.com/office/drawing/2015/9/8/chartex" xmlns:cx2="http://schemas.microsoft.com/office/drawing/2015/10/21/chartex" xmlns:cx3="http://schemas.microsoft.com/office/drawing/2016/5/9/chartex" xmlns:cx4="http://schemas.microsoft.com/office/drawing/2016/5/10/chartex" xmlns:cx5="http://schemas.microsoft.com/office/drawing/2016/5/11/chartex" xmlns:cx6="http://schemas.microsoft.com/office/drawing/2016/5/12/chartex" xmlns:cx7="http://schemas.microsoft.com/office/drawing/2016/5/13/chartex" xmlns:cx8="http://schemas.microsoft.com/office/drawing/2016/5/14/chartex" xmlns:mc="http://schemas.openxmlformats.org/markup-compatibility/2006" xmlns:aink="http://schemas.microsoft.com/office/drawing/2016/ink" xmlns:am3d="http://schemas.microsoft.com/office/drawing/2017/model3d" xmlns:o="urn:schemas-microsoft-com:office:office" xmlns:oel="http://schemas.microsoft.com/office/2019/extlst" xmlns:r="http://schemas.openxmlformats.org/officeDocument/2006/relationships" xmlns:m="http://schemas.openxmlformats.org/officeDocument/2006/math" xmlns:v="urn:schemas-microsoft-com:vml" xmlns:wp14="http://schemas.microsoft.com/office/word/2010/wordprocessingDrawing" xmlns:wp="http://schemas.openxmlformats.org/drawingml/2006/wordprocessingDrawing" xmlns:w10="urn:schemas-microsoft-com:office:word" xmlns:w="http://schemas.openxmlformats.org/wordprocessingml/2006/main" xmlns:w14="http://schemas.microsoft.com/office/word/2010/wordml" xmlns:w15="http://schemas.microsoft.com/office/word/2012/wordml" xmlns:w16cei="http://schemas.microsoft.com/office/word/2026/wordml/cei" xmlns:w16cex="http://schemas.microsoft.com/office/word/2018/wordml/cex" xmlns:w16cid="http://schemas.microsoft.com/office/word/2016/wordml/cid" xmlns:w16="http://schemas.microsoft.com/office/word/2018/wordml" xmlns:w16du="http://schemas.microsoft.com/office/word/2023/wordml/word16du" xmlns:w16sdtdh="http://schemas.microsoft.com/office/word/2020/wordml/sdtdatahash" xmlns:w16sdtfl="http://schemas.microsoft.com/office/word/2024/wordml/sdtformatlock" xmlns:w16se="http://schemas.microsoft.com/office/word/2015/wordml/symex" xmlns:wpg="http://schemas.microsoft.com/office/word/2010/wordprocessingGroup" xmlns:wpi="http://schemas.microsoft.com/office/word/2010/wordprocessingInk" xmlns:wne="http://schemas.microsoft.com/office/word/2006/wordml" xmlns:wps="http://schemas.microsoft.com/office/word/2010/wordprocessingShape" mc:Ignorable="w14 w15 w16se w16cid w16 w16cex w16sdtdh w16sdtfl w16du wp14">
   <w:abstractNum w:abstractNumId="0" w15:restartNumberingAfterBreak="0">
     <w:nsid w:val="092E5E8E"/>
     <w:multiLevelType w:val="hybridMultilevel"/>

</xml_diff>